<commit_message>
ajout du document de rapport
</commit_message>
<xml_diff>
--- a/Rapport/Rapport_INF1833_Prix_Voitures_.docx
+++ b/Rapport/Rapport_INF1833_Prix_Voitures_.docx
@@ -6,17 +6,37 @@
       <w:pPr>
         <w:jc w:val="center"/>
         <w:rPr>
-          <w:lang w:val="fr-CA"/>
-        </w:rPr>
-      </w:pPr>
-      <w:r>
-        <w:rPr>
           <w:b/>
           <w:sz w:val="36"/>
           <w:lang w:val="fr-CA"/>
         </w:rPr>
+      </w:pPr>
+      <w:r>
+        <w:rPr>
+          <w:b/>
+          <w:sz w:val="36"/>
+          <w:lang w:val="fr-CA"/>
+        </w:rPr>
         <w:t>Université du Québec en Outaouais</w:t>
       </w:r>
+    </w:p>
+    <w:p>
+      <w:pPr>
+        <w:jc w:val="center"/>
+        <w:rPr>
+          <w:b/>
+          <w:sz w:val="36"/>
+          <w:lang w:val="fr-CA"/>
+        </w:rPr>
+      </w:pPr>
+    </w:p>
+    <w:p>
+      <w:pPr>
+        <w:jc w:val="center"/>
+        <w:rPr>
+          <w:lang w:val="fr-CA"/>
+        </w:rPr>
+      </w:pPr>
     </w:p>
     <w:p>
       <w:pPr>
@@ -173,13 +193,7 @@
         <w:rPr>
           <w:lang w:val="fr-CA"/>
         </w:rPr>
-        <w:t>C</w:t>
-      </w:r>
-      <w:r>
-        <w:rPr>
-          <w:lang w:val="fr-CA"/>
-        </w:rPr>
-        <w:t>ollaborateurs</w:t>
+        <w:t>Collaborateurs</w:t>
       </w:r>
     </w:p>
     <w:p>
@@ -208,16 +222,8 @@
         <w:rPr>
           <w:lang w:val="fr-CA"/>
         </w:rPr>
-        <w:t xml:space="preserve"> Daniel </w:t>
+        <w:t xml:space="preserve"> Daniel Yapi</w:t>
       </w:r>
-      <w:proofErr w:type="spellStart"/>
-      <w:r>
-        <w:rPr>
-          <w:lang w:val="fr-CA"/>
-        </w:rPr>
-        <w:t>Yapi</w:t>
-      </w:r>
-      <w:proofErr w:type="spellEnd"/>
     </w:p>
     <w:p>
       <w:pPr>
@@ -235,6 +241,12 @@
     <w:sdt>
       <w:sdtPr>
         <w:rPr>
+          <w:rFonts w:asciiTheme="minorHAnsi" w:eastAsiaTheme="minorEastAsia" w:hAnsiTheme="minorHAnsi" w:cstheme="minorBidi"/>
+          <w:b w:val="0"/>
+          <w:bCs w:val="0"/>
+          <w:color w:val="auto"/>
+          <w:sz w:val="22"/>
+          <w:szCs w:val="22"/>
           <w:lang w:val="fr-FR"/>
         </w:rPr>
         <w:id w:val="1974101404"/>
@@ -243,14 +255,6 @@
           <w:docPartUnique/>
         </w:docPartObj>
       </w:sdtPr>
-      <w:sdtEndPr>
-        <w:rPr>
-          <w:rFonts w:asciiTheme="minorHAnsi" w:eastAsiaTheme="minorEastAsia" w:hAnsiTheme="minorHAnsi" w:cstheme="minorBidi"/>
-          <w:color w:val="auto"/>
-          <w:sz w:val="22"/>
-          <w:szCs w:val="22"/>
-        </w:rPr>
-      </w:sdtEndPr>
       <w:sdtContent>
         <w:p>
           <w:pPr>
@@ -258,6 +262,7 @@
             <w:rPr>
               <w:sz w:val="32"/>
               <w:szCs w:val="32"/>
+              <w:lang w:val="fr-CA"/>
             </w:rPr>
           </w:pPr>
           <w:r>

</xml_diff>